<commit_message>
Un seul projet d'exercice : les deux vagues dans « SIMULATION de formation »
Les 21 entretiens et les 16 grilles d'observation sont réunis dans le projet
memoire-ngoma-simulation (même identifiant et même nom que celui déjà ouvert
dans l'application, qu'il remplace) : 37 documents, 90 codes, 2 559 segments,
double codage (C2) d'un tiers des entretiens, stabilité intra-codeur (C1b),
mémos des six phases et piste d'audit.

Livrables Word : annexes 1, 2, 3, 4 (registre des consentements, sans aucune
signature simulée) et 9 (données de routine fictives, par code de centre)
dans un seul document, transcriptions verbatim dans un second, guide mis à
jour avec des chiffres calculés. Les fichiers séparés de la vague 2 et le
projet « complet » sont supprimés.

Co-Authored-By: Claude Opus 5.5 <noreply@anthropic.com>
Claude-Session: https://claude.ai/code/session_01HxwPseJn9EZbm4HRSeCoVh
</commit_message>
<xml_diff>
--- a/memoire-ngoma/livrables/3_Guide_QualiCode_pour_ce_memoire.docx
+++ b/memoire-ngoma/livrables/3_Guide_QualiCode_pour_ce_memoire.docx
@@ -661,7 +661,7 @@
           <w:sz w:val="21"/>
           <w:szCs w:val="21"/>
         </w:rPr>
-        <w:t xml:space="preserve">Vous devez voir apparaître, en bas de l'écran : 15 documents · 79 codes · 1 220 segments codés.</w:t>
+        <w:t xml:space="preserve">Vous devez voir apparaître, en bas de l'écran : 37 documents · 90 codes · 2 559 segments codés.</w:t>
       </w:r>
     </w:p>
     <w:p/>
@@ -803,7 +803,7 @@
                 <w:sz w:val="20"/>
                 <w:szCs w:val="20"/>
               </w:rPr>
-              <w:t xml:space="preserve">79 codes en 11 familles, dont 21 créés en cours de codage</w:t>
+              <w:t xml:space="preserve">90 codes en 11 familles, dont 32 créés en cours de codage</w:t>
             </w:r>
           </w:p>
         </w:tc>
@@ -1048,7 +1048,7 @@
                 <w:sz w:val="20"/>
                 <w:szCs w:val="20"/>
               </w:rPr>
-              <w:t xml:space="preserve">Un second codage (codeur C2) sur trois entretiens</w:t>
+              <w:t xml:space="preserve">Un second codage (codeur C2) sur 7 entretiens, et un recodage intra-codeur (C1b) sur 2</w:t>
             </w:r>
           </w:p>
         </w:tc>
@@ -1071,120 +1071,6 @@
                 <w:szCs w:val="20"/>
               </w:rPr>
               <w:t xml:space="preserve">Onglet Analyse ▸ Accord inter-codeurs (κ)</w:t>
-            </w:r>
-          </w:p>
-        </w:tc>
-      </w:tr>
-    </w:tbl>
-    <w:p/>
-    <w:p>
-      <w:pPr>
-        <w:pStyle w:val="Heading2"/>
-      </w:pPr>
-      <w:r>
-        <w:t xml:space="preserve">Les trois projets d'exercice</w:t>
-      </w:r>
-    </w:p>
-    <w:p>
-      <w:pPr>
-        <w:spacing w:after="100"/>
-      </w:pPr>
-      <w:r>
-        <w:rPr>
-          <w:sz w:val="21"/>
-          <w:szCs w:val="21"/>
-        </w:rPr>
-        <w:t xml:space="preserve">Une seconde vague simulée complète la première : onze participants (six sages-femmes, cinq infirmiers ou infirmières) dans les onze centres que la vague 1 ne couvrait pas. Trois fichiers en résultent :</w:t>
-      </w:r>
-    </w:p>
-    <w:p/>
-    <w:tbl>
-      <w:tblPr>
-        <w:tblW w:type="dxa" w:w="9026"/>
-        <w:tblBorders>
-          <w:top w:val="single" w:color="auto" w:sz="4"/>
-          <w:left w:val="single" w:color="auto" w:sz="4"/>
-          <w:bottom w:val="single" w:color="auto" w:sz="4"/>
-          <w:right w:val="single" w:color="auto" w:sz="4"/>
-          <w:insideH w:val="single" w:color="auto" w:sz="4"/>
-          <w:insideV w:val="single" w:color="auto" w:sz="4"/>
-        </w:tblBorders>
-      </w:tblPr>
-      <w:tblGrid>
-        <w:gridCol w:w="3200"/>
-        <w:gridCol w:w="3200"/>
-        <w:gridCol w:w="2626"/>
-      </w:tblGrid>
-      <w:tr>
-        <w:trPr>
-          <w:tblHeader/>
-        </w:trPr>
-        <w:tc>
-          <w:tcPr>
-            <w:tcW w:type="dxa" w:w="3200"/>
-            <w:shd w:fill="E8EDF2" w:color="auto" w:val="clear"/>
-            <w:tcMar>
-              <w:top w:type="dxa" w:w="70"/>
-              <w:left w:type="dxa" w:w="110"/>
-              <w:bottom w:type="dxa" w:w="70"/>
-              <w:right w:type="dxa" w:w="110"/>
-            </w:tcMar>
-          </w:tcPr>
-          <w:p>
-            <w:r>
-              <w:rPr>
-                <w:b/>
-                <w:bCs/>
-                <w:sz w:val="20"/>
-                <w:szCs w:val="20"/>
-              </w:rPr>
-              <w:t xml:space="preserve">Fichier</w:t>
-            </w:r>
-          </w:p>
-        </w:tc>
-        <w:tc>
-          <w:tcPr>
-            <w:tcW w:type="dxa" w:w="3200"/>
-            <w:shd w:fill="E8EDF2" w:color="auto" w:val="clear"/>
-            <w:tcMar>
-              <w:top w:type="dxa" w:w="70"/>
-              <w:left w:type="dxa" w:w="110"/>
-              <w:bottom w:type="dxa" w:w="70"/>
-              <w:right w:type="dxa" w:w="110"/>
-            </w:tcMar>
-          </w:tcPr>
-          <w:p>
-            <w:r>
-              <w:rPr>
-                <w:b/>
-                <w:bCs/>
-                <w:sz w:val="20"/>
-                <w:szCs w:val="20"/>
-              </w:rPr>
-              <w:t xml:space="preserve">Contenu</w:t>
-            </w:r>
-          </w:p>
-        </w:tc>
-        <w:tc>
-          <w:tcPr>
-            <w:tcW w:type="dxa" w:w="2626"/>
-            <w:shd w:fill="E8EDF2" w:color="auto" w:val="clear"/>
-            <w:tcMar>
-              <w:top w:type="dxa" w:w="70"/>
-              <w:left w:type="dxa" w:w="110"/>
-              <w:bottom w:type="dxa" w:w="70"/>
-              <w:right w:type="dxa" w:w="110"/>
-            </w:tcMar>
-          </w:tcPr>
-          <w:p>
-            <w:r>
-              <w:rPr>
-                <w:b/>
-                <w:bCs/>
-                <w:sz w:val="20"/>
-                <w:szCs w:val="20"/>
-              </w:rPr>
-              <w:t xml:space="preserve">À quoi il sert</w:t>
             </w:r>
           </w:p>
         </w:tc>
@@ -1195,209 +1081,45 @@
         </w:trPr>
         <w:tc>
           <w:tcPr>
-            <w:tcW w:type="dxa" w:w="3200"/>
-            <w:tcMar>
-              <w:top w:type="dxa" w:w="70"/>
-              <w:left w:type="dxa" w:w="110"/>
-              <w:bottom w:type="dxa" w:w="70"/>
-              <w:right w:type="dxa" w:w="110"/>
-            </w:tcMar>
-          </w:tcPr>
-          <w:p>
-            <w:r>
-              <w:rPr>
-                <w:b w:val="false"/>
-                <w:bCs w:val="false"/>
-                <w:sz w:val="20"/>
-                <w:szCs w:val="20"/>
-              </w:rPr>
-              <w:t xml:space="preserve">Memoire_Ngoma_SIMULATION.projx</w:t>
-            </w:r>
-          </w:p>
-        </w:tc>
-        <w:tc>
-          <w:tcPr>
-            <w:tcW w:type="dxa" w:w="3200"/>
-            <w:tcMar>
-              <w:top w:type="dxa" w:w="70"/>
-              <w:left w:type="dxa" w:w="110"/>
-              <w:bottom w:type="dxa" w:w="70"/>
-              <w:right w:type="dxa" w:w="110"/>
-            </w:tcMar>
-          </w:tcPr>
-          <w:p>
-            <w:r>
-              <w:rPr>
-                <w:b w:val="false"/>
-                <w:bCs w:val="false"/>
-                <w:sz w:val="20"/>
-                <w:szCs w:val="20"/>
-              </w:rPr>
-              <w:t xml:space="preserve">Vague 1 : 10 entretiens, 5 centres, 79 codes, 1 220 segments</w:t>
-            </w:r>
-          </w:p>
-        </w:tc>
-        <w:tc>
-          <w:tcPr>
-            <w:tcW w:type="dxa" w:w="2626"/>
-            <w:tcMar>
-              <w:top w:type="dxa" w:w="70"/>
-              <w:left w:type="dxa" w:w="110"/>
-              <w:bottom w:type="dxa" w:w="70"/>
-              <w:right w:type="dxa" w:w="110"/>
-            </w:tcMar>
-          </w:tcPr>
-          <w:p>
-            <w:r>
-              <w:rPr>
-                <w:b w:val="false"/>
-                <w:bCs w:val="false"/>
-                <w:sz w:val="20"/>
-                <w:szCs w:val="20"/>
-              </w:rPr>
-              <w:t xml:space="preserve">Premiers gestes : coder, récupérer, annoter</w:t>
-            </w:r>
-          </w:p>
-        </w:tc>
-      </w:tr>
-      <w:tr>
-        <w:trPr>
-          <w:tblHeader w:val="off"/>
-        </w:trPr>
-        <w:tc>
-          <w:tcPr>
-            <w:tcW w:type="dxa" w:w="3200"/>
-            <w:tcMar>
-              <w:top w:type="dxa" w:w="70"/>
-              <w:left w:type="dxa" w:w="110"/>
-              <w:bottom w:type="dxa" w:w="70"/>
-              <w:right w:type="dxa" w:w="110"/>
-            </w:tcMar>
-          </w:tcPr>
-          <w:p>
-            <w:r>
-              <w:rPr>
-                <w:b w:val="false"/>
-                <w:bCs w:val="false"/>
-                <w:sz w:val="20"/>
-                <w:szCs w:val="20"/>
-              </w:rPr>
-              <w:t xml:space="preserve">Memoire_Ngoma_SIMULATION_vague2.projx</w:t>
-            </w:r>
-          </w:p>
-        </w:tc>
-        <w:tc>
-          <w:tcPr>
-            <w:tcW w:type="dxa" w:w="3200"/>
-            <w:tcMar>
-              <w:top w:type="dxa" w:w="70"/>
-              <w:left w:type="dxa" w:w="110"/>
-              <w:bottom w:type="dxa" w:w="70"/>
-              <w:right w:type="dxa" w:w="110"/>
-            </w:tcMar>
-          </w:tcPr>
-          <w:p>
-            <w:r>
-              <w:rPr>
-                <w:b w:val="false"/>
-                <w:bCs w:val="false"/>
-                <w:sz w:val="20"/>
-                <w:szCs w:val="20"/>
-              </w:rPr>
-              <w:t xml:space="preserve">Vague 2 : 11 entretiens, 11 centres, 90 codes, 1 118 segments</w:t>
-            </w:r>
-          </w:p>
-        </w:tc>
-        <w:tc>
-          <w:tcPr>
-            <w:tcW w:type="dxa" w:w="2626"/>
-            <w:tcMar>
-              <w:top w:type="dxa" w:w="70"/>
-              <w:left w:type="dxa" w:w="110"/>
-              <w:bottom w:type="dxa" w:w="70"/>
-              <w:right w:type="dxa" w:w="110"/>
-            </w:tcMar>
-          </w:tcPr>
-          <w:p>
-            <w:r>
-              <w:rPr>
-                <w:b w:val="false"/>
-                <w:bCs w:val="false"/>
-                <w:sz w:val="20"/>
-                <w:szCs w:val="20"/>
-              </w:rPr>
-              <w:t xml:space="preserve">Voir naître des codes inductifs sur un matériau neuf</w:t>
-            </w:r>
-          </w:p>
-        </w:tc>
-      </w:tr>
-      <w:tr>
-        <w:trPr>
-          <w:tblHeader w:val="off"/>
-        </w:trPr>
-        <w:tc>
-          <w:tcPr>
-            <w:tcW w:type="dxa" w:w="3200"/>
-            <w:tcMar>
-              <w:top w:type="dxa" w:w="70"/>
-              <w:left w:type="dxa" w:w="110"/>
-              <w:bottom w:type="dxa" w:w="70"/>
-              <w:right w:type="dxa" w:w="110"/>
-            </w:tcMar>
-          </w:tcPr>
-          <w:p>
-            <w:r>
-              <w:rPr>
-                <w:b w:val="false"/>
-                <w:bCs w:val="false"/>
-                <w:sz w:val="20"/>
-                <w:szCs w:val="20"/>
-              </w:rPr>
-              <w:t xml:space="preserve">Memoire_Ngoma_SIMULATION_complet.projx</w:t>
-            </w:r>
-          </w:p>
-        </w:tc>
-        <w:tc>
-          <w:tcPr>
-            <w:tcW w:type="dxa" w:w="3200"/>
-            <w:tcMar>
-              <w:top w:type="dxa" w:w="70"/>
-              <w:left w:type="dxa" w:w="110"/>
-              <w:bottom w:type="dxa" w:w="70"/>
-              <w:right w:type="dxa" w:w="110"/>
-            </w:tcMar>
-          </w:tcPr>
-          <w:p>
-            <w:r>
-              <w:rPr>
-                <w:b w:val="false"/>
-                <w:bCs w:val="false"/>
-                <w:sz w:val="20"/>
-                <w:szCs w:val="20"/>
-              </w:rPr>
-              <w:t xml:space="preserve">Les deux vagues : 21 entretiens, 16 centres, 90 codes, 2 401 segments</w:t>
-            </w:r>
-          </w:p>
-        </w:tc>
-        <w:tc>
-          <w:tcPr>
-            <w:tcW w:type="dxa" w:w="2626"/>
-            <w:tcMar>
-              <w:top w:type="dxa" w:w="70"/>
-              <w:left w:type="dxa" w:w="110"/>
-              <w:bottom w:type="dxa" w:w="70"/>
-              <w:right w:type="dxa" w:w="110"/>
-            </w:tcMar>
-          </w:tcPr>
-          <w:p>
-            <w:r>
-              <w:rPr>
-                <w:b w:val="false"/>
-                <w:bCs w:val="false"/>
-                <w:sz w:val="20"/>
-                <w:szCs w:val="20"/>
-              </w:rPr>
-              <w:t xml:space="preserve">L'analyse d'ensemble — c'est la configuration visée par le protocole</w:t>
+            <w:tcW w:type="dxa" w:w="4600"/>
+            <w:tcMar>
+              <w:top w:type="dxa" w:w="70"/>
+              <w:left w:type="dxa" w:w="110"/>
+              <w:bottom w:type="dxa" w:w="70"/>
+              <w:right w:type="dxa" w:w="110"/>
+            </w:tcMar>
+          </w:tcPr>
+          <w:p>
+            <w:r>
+              <w:rPr>
+                <w:b w:val="false"/>
+                <w:bCs w:val="false"/>
+                <w:sz w:val="20"/>
+                <w:szCs w:val="20"/>
+              </w:rPr>
+              <w:t xml:space="preserve">Les variables « vague », « citation_autorisee » et « recontact_accepte »</w:t>
+            </w:r>
+          </w:p>
+        </w:tc>
+        <w:tc>
+          <w:tcPr>
+            <w:tcW w:type="dxa" w:w="4426"/>
+            <w:tcMar>
+              <w:top w:type="dxa" w:w="70"/>
+              <w:left w:type="dxa" w:w="110"/>
+              <w:bottom w:type="dxa" w:w="70"/>
+              <w:right w:type="dxa" w:w="110"/>
+            </w:tcMar>
+          </w:tcPr>
+          <w:p>
+            <w:r>
+              <w:rPr>
+                <w:b w:val="false"/>
+                <w:bCs w:val="false"/>
+                <w:sz w:val="20"/>
+                <w:szCs w:val="20"/>
+              </w:rPr>
+              <w:t xml:space="preserve">Onglet Variables ▸ Éditeur de données</w:t>
             </w:r>
           </w:p>
         </w:tc>
@@ -1406,6 +1128,14 @@
     <w:p/>
     <w:p>
       <w:pPr>
+        <w:pStyle w:val="Heading2"/>
+      </w:pPr>
+      <w:r>
+        <w:t xml:space="preserve">Un seul projet, deux vagues</w:t>
+      </w:r>
+    </w:p>
+    <w:p>
+      <w:pPr>
         <w:spacing w:after="100"/>
       </w:pPr>
       <w:r>
@@ -1413,7 +1143,19 @@
           <w:sz w:val="21"/>
           <w:szCs w:val="21"/>
         </w:rPr>
-        <w:t xml:space="preserve">Pour s'exercer à l'analyse elle-même — comparaison entre infirmiers et sages-femmes, revue des thèmes, suffisance informationnelle — ouvrez le projet complet. Il contient un mémo qui conduit l'exercice de suffisance informationnelle dimension par dimension, comme l'exige le § 4.2.3.1, et un mémo de positionnalité laissé VIDE : celui-là ne peut pas être simulé, il vous appartient.</w:t>
+        <w:t xml:space="preserve">Le projet « Mémoire Ngoma — SIMULATION de formation » réunit les deux vagues simulées : 10 entretiens en vague 1, 11 en vague 2, soit 21 participants dans les 16 centres de santé du district — la configuration visée par le § 4.2.3.1. La variable « vague » permet de retrouver l'une ou l'autre.</w:t>
+      </w:r>
+    </w:p>
+    <w:p>
+      <w:pPr>
+        <w:spacing w:after="100"/>
+      </w:pPr>
+      <w:r>
+        <w:rPr>
+          <w:sz w:val="21"/>
+          <w:szCs w:val="21"/>
+        </w:rPr>
+        <w:t xml:space="preserve">Il porte le même nom et le même identifiant que le projet de la vague 1 déjà présent dans votre application : l'ouvrir par Accueil ▸ Ouvrir (.projx) le REMPLACE, au lieu de créer un doublon. Si la version présente dans votre navigateur est plus récente que le fichier, l'application vous prévient avant de remplacer quoi que ce soit.</w:t>
       </w:r>
     </w:p>
     <w:p/>
@@ -1429,6 +1171,19 @@
           <w:szCs w:val="21"/>
         </w:rPr>
         <w:t xml:space="preserve">Ce que la vague 2 apporte en propre : un centre bien doté (CS01) qui montre ce que change l'équipement — et ce qu'il ne change pas ; un registre rempli sans que les actes suivent (CS13) ; les agents de santé communautaire comme relais ; le recours aux guérisseurs tel que les prestataires le perçoivent ; des femmes mobiles que le suivi perd ; et une participante qui refuse de classer les femmes en catégories. Onze codes inductifs en sont nés, signalés « [inductif, vague 2] ».</w:t>
+      </w:r>
+    </w:p>
+    <w:p/>
+    <w:p>
+      <w:pPr>
+        <w:spacing w:after="100"/>
+      </w:pPr>
+      <w:r>
+        <w:rPr>
+          <w:sz w:val="21"/>
+          <w:szCs w:val="21"/>
+        </w:rPr>
+        <w:t xml:space="preserve">Les mémos suivent les six phases de l'analyse thématique, puis les étapes de rigueur du protocole : contrôle de fidélité des transcriptions, double codage et stabilité intra-codeur, triangulation, vérification des interprétations auprès des participants, suffisance informationnelle, piste d'audit. La note de positionnalité est laissée VIDE : elle ne peut pas être simulée, elle vous appartient.</w:t>
       </w:r>
     </w:p>
     <w:p>
@@ -1681,7 +1436,7 @@
                 <w:sz w:val="20"/>
                 <w:szCs w:val="20"/>
               </w:rPr>
-              <w:t xml:space="preserve">Dans le projet de la vague 1, les 21 codes nés du matériau portent la mention « [inductif] » dans leur intitulé ; le projet complet en compte 32. Ce n'est pas une coquetterie : c'est la trace qui permet au jury de vérifier que la grille est restée ouverte, comme l'annonce le § 4.2.6.</w:t>
+              <w:t xml:space="preserve">Dans le projet d'exercice, les 32 codes nés du matériau portent la mention « [inductif] » dans leur intitulé — « [inductif, vague 2] » pour ceux que la seconde vague a fait naître. Ce n'est pas une coquetterie : c'est la trace qui permet au jury de vérifier que la grille est restée ouverte, comme l'annonce le § 4.2.6.</w:t>
             </w:r>
           </w:p>
           <w:p>
@@ -2364,7 +2119,7 @@
                 <w:sz w:val="20"/>
                 <w:szCs w:val="20"/>
               </w:rPr>
-              <w:t xml:space="preserve">Sur le projet d'exercice, κ = 0,867 — « accord presque parfait » selon Landis et Koch. Ce chiffre est pourtant optimiste, et il faut savoir l'expliquer.</w:t>
+              <w:t xml:space="preserve">Sur le projet d'exercice, κ = 0,864 entre les deux codeurs (7 entretiens) et 0,957 pour la stabilité intra-codeur (2 entretiens recodés par le même codeur, étiquette C1b) — « accord presque parfait » selon Landis et Koch. Ces chiffres sont pourtant optimistes, et il faut savoir l'expliquer.</w:t>
             </w:r>
           </w:p>
           <w:p>
@@ -2862,7 +2617,7 @@
           <w:sz w:val="21"/>
           <w:szCs w:val="21"/>
         </w:rPr>
-        <w:t xml:space="preserve">Sur le projet d'exercice, l'aller-retour a été vérifié : les 15 documents, 79 codes et 1 220 segments reviennent intacts, sans qu'aucune borne de codage ne bouge. Vous n'êtes donc enfermé nulle part — argument utile si un membre du jury s'inquiète du choix de l'outil.</w:t>
+        <w:t xml:space="preserve">Sur le projet d'exercice, l'aller-retour a été vérifié : les 37 documents, 90 codes et 2 559 segments reviennent intacts, sans qu'aucune borne de codage ne bouge. Vous n'êtes donc enfermé nulle part — argument utile si un membre du jury s'inquiète du choix de l'outil.</w:t>
       </w:r>
     </w:p>
     <w:p>

</xml_diff>

<commit_message>
Rédiger le chapitre 5 (Résultats) en exercice, à partir du projet
Le chapitre suit le plan du mémo « Phase 6 » : participants et centres,
objectifs spécifiques 1 et 2, sept thèmes, portée en équité,
transformations, triangulation. 49 citations, toutes vérifiées à la
production contre un passage codé du participant ; P05 ne peut pas être
cité, aucun code de centre n'apparaît, et le centre protégé par le
consentement de P19 est contrôlé dans le document produit. Tous les
effectifs sont calculés.

Mise en page Word commune extraite dans mise-en-page.mjs (sortie
identique). Un mémo relie chaque citation à son participant et à ses
codes. Corrigés au passage : deux chiffres faux dans les mémos, et le
tableau du guide resté aux effectifs de la première vague.

Co-Authored-By: Claude Opus 5.5 <noreply@anthropic.com>
Claude-Session: https://claude.ai/code/session_01HxwPseJn9EZbm4HRSeCoVh
</commit_message>
<xml_diff>
--- a/memoire-ngoma/livrables/3_Guide_QualiCode_pour_ce_memoire.docx
+++ b/memoire-ngoma/livrables/3_Guide_QualiCode_pour_ce_memoire.docx
@@ -754,7 +754,7 @@
                 <w:sz w:val="20"/>
                 <w:szCs w:val="20"/>
               </w:rPr>
-              <w:t xml:space="preserve">10 transcriptions d'entretiens + 5 comptes rendus d'observation</w:t>
+              <w:t xml:space="preserve">21 transcriptions d'entretiens + 16 comptes rendus d'observation</w:t>
             </w:r>
           </w:p>
         </w:tc>
@@ -852,7 +852,7 @@
                 <w:sz w:val="20"/>
                 <w:szCs w:val="20"/>
               </w:rPr>
-              <w:t xml:space="preserve">15 variables de document (qualification, secteur, ancienneté…)</w:t>
+              <w:t xml:space="preserve">19 variables de document (qualification, secteur, ancienneté…)</w:t>
             </w:r>
           </w:p>
         </w:tc>
@@ -901,7 +901,7 @@
                 <w:sz w:val="20"/>
                 <w:szCs w:val="20"/>
               </w:rPr>
-              <w:t xml:space="preserve">20 mémos : journal de bord par entretien, mémos de phase, piste d'audit</w:t>
+              <w:t xml:space="preserve">52 mémos : journal de bord par entretien, mémos de phase, piste d'audit, définitions des familles</w:t>
             </w:r>
           </w:p>
         </w:tc>
@@ -950,7 +950,7 @@
                 <w:sz w:val="20"/>
                 <w:szCs w:val="20"/>
               </w:rPr>
-              <w:t xml:space="preserve">8 requêtes sauvegardées correspondant aux thèmes provisoires</w:t>
+              <w:t xml:space="preserve">15 requêtes sauvegardées (thèmes, extraits citables…)</w:t>
             </w:r>
           </w:p>
         </w:tc>

</xml_diff>